<commit_message>
Update valuation scripts and templates
</commit_message>
<xml_diff>
--- a/templates/FEDERAL/valuation_template.docx
+++ b/templates/FEDERAL/valuation_template.docx
@@ -1,6 +1,6 @@
 
 <file path=word/document.xml><?xml version="1.0" encoding="utf-8"?>
-<w:document xmlns:wpc="http://schemas.microsoft.com/office/word/2010/wordprocessingCanvas" xmlns:cx="http://schemas.microsoft.com/office/drawing/2014/chartex" xmlns:cx1="http://schemas.microsoft.com/office/drawing/2015/9/8/chartex" xmlns:cx2="http://schemas.microsoft.com/office/drawing/2015/10/21/chartex" xmlns:cx3="http://schemas.microsoft.com/office/drawing/2016/5/9/chartex" xmlns:cx4="http://schemas.microsoft.com/office/drawing/2016/5/10/chartex" xmlns:cx5="http://schemas.microsoft.com/office/drawing/2016/5/11/chartex" xmlns:cx6="http://schemas.microsoft.com/office/drawing/2016/5/12/chartex" xmlns:cx7="http://schemas.microsoft.com/office/drawing/2016/5/13/chartex" xmlns:cx8="http://schemas.microsoft.com/office/drawing/2016/5/14/chartex" xmlns:mc="http://schemas.openxmlformats.org/markup-compatibility/2006" xmlns:aink="http://schemas.microsoft.com/office/drawing/2016/ink" xmlns:am3d="http://schemas.microsoft.com/office/drawing/2017/model3d" xmlns:o="urn:schemas-microsoft-com:office:office" xmlns:oel="http://schemas.microsoft.com/office/2019/extlst" xmlns:r="http://schemas.openxmlformats.org/officeDocument/2006/relationships" xmlns:m="http://schemas.openxmlformats.org/officeDocument/2006/math" xmlns:v="urn:schemas-microsoft-com:vml" xmlns:wp14="http://schemas.microsoft.com/office/word/2010/wordprocessingDrawing" xmlns:wp="http://schemas.openxmlformats.org/drawingml/2006/wordprocessingDrawing" xmlns:w10="urn:schemas-microsoft-com:office:word" xmlns:w="http://schemas.openxmlformats.org/wordprocessingml/2006/main" xmlns:w14="http://schemas.microsoft.com/office/word/2010/wordml" xmlns:w15="http://schemas.microsoft.com/office/word/2012/wordml" xmlns:w16cex="http://schemas.microsoft.com/office/word/2018/wordml/cex" xmlns:w16cid="http://schemas.microsoft.com/office/word/2016/wordml/cid" xmlns:w16="http://schemas.microsoft.com/office/word/2018/wordml" xmlns:w16du="http://schemas.microsoft.com/office/word/2023/wordml/word16du" xmlns:w16sdtdh="http://schemas.microsoft.com/office/word/2020/wordml/sdtdatahash" xmlns:w16sdtfl="http://schemas.microsoft.com/office/word/2024/wordml/sdtformatlock" xmlns:w16se="http://schemas.microsoft.com/office/word/2015/wordml/symex" xmlns:wpg="http://schemas.microsoft.com/office/word/2010/wordprocessingGroup" xmlns:wpi="http://schemas.microsoft.com/office/word/2010/wordprocessingInk" xmlns:wne="http://schemas.microsoft.com/office/word/2006/wordml" xmlns:wps="http://schemas.microsoft.com/office/word/2010/wordprocessingShape" mc:Ignorable="w14 w15 w16se w16cid w16 w16cex w16sdtdh w16sdtfl w16du wp14">
+<w:document xmlns:wpc="http://schemas.microsoft.com/office/word/2010/wordprocessingCanvas" xmlns:cx="http://schemas.microsoft.com/office/drawing/2014/chartex" xmlns:cx1="http://schemas.microsoft.com/office/drawing/2015/9/8/chartex" xmlns:cx2="http://schemas.microsoft.com/office/drawing/2015/10/21/chartex" xmlns:cx3="http://schemas.microsoft.com/office/drawing/2016/5/9/chartex" xmlns:cx4="http://schemas.microsoft.com/office/drawing/2016/5/10/chartex" xmlns:cx5="http://schemas.microsoft.com/office/drawing/2016/5/11/chartex" xmlns:cx6="http://schemas.microsoft.com/office/drawing/2016/5/12/chartex" xmlns:cx7="http://schemas.microsoft.com/office/drawing/2016/5/13/chartex" xmlns:cx8="http://schemas.microsoft.com/office/drawing/2016/5/14/chartex" xmlns:mc="http://schemas.openxmlformats.org/markup-compatibility/2006" xmlns:aink="http://schemas.microsoft.com/office/drawing/2016/ink" xmlns:am3d="http://schemas.microsoft.com/office/drawing/2017/model3d" xmlns:o="urn:schemas-microsoft-com:office:office" xmlns:oel="http://schemas.microsoft.com/office/2019/extlst" xmlns:r="http://schemas.openxmlformats.org/officeDocument/2006/relationships" xmlns:m="http://schemas.openxmlformats.org/officeDocument/2006/math" xmlns:v="urn:schemas-microsoft-com:vml" xmlns:wp14="http://schemas.microsoft.com/office/word/2010/wordprocessingDrawing" xmlns:wp="http://schemas.openxmlformats.org/drawingml/2006/wordprocessingDrawing" xmlns:w10="urn:schemas-microsoft-com:office:word" xmlns:w="http://schemas.openxmlformats.org/wordprocessingml/2006/main" xmlns:w14="http://schemas.microsoft.com/office/word/2010/wordml" xmlns:w15="http://schemas.microsoft.com/office/word/2012/wordml" xmlns:w16cei="http://schemas.microsoft.com/office/word/2026/wordml/cei" xmlns:w16cex="http://schemas.microsoft.com/office/word/2018/wordml/cex" xmlns:w16cid="http://schemas.microsoft.com/office/word/2016/wordml/cid" xmlns:w16="http://schemas.microsoft.com/office/word/2018/wordml" xmlns:w16du="http://schemas.microsoft.com/office/word/2023/wordml/word16du" xmlns:w16sdtdh="http://schemas.microsoft.com/office/word/2020/wordml/sdtdatahash" xmlns:w16sdtfl="http://schemas.microsoft.com/office/word/2024/wordml/sdtformatlock" xmlns:w16se="http://schemas.microsoft.com/office/word/2015/wordml/symex" xmlns:wpg="http://schemas.microsoft.com/office/word/2010/wordprocessingGroup" xmlns:wpi="http://schemas.microsoft.com/office/word/2010/wordprocessingInk" xmlns:wne="http://schemas.microsoft.com/office/word/2006/wordml" xmlns:wps="http://schemas.microsoft.com/office/word/2010/wordprocessingShape" mc:Ignorable="w14 w15 w16se w16cid w16 w16cex w16sdtdh w16sdtfl w16du wp14">
   <w:body>
     <w:p>
       <w:pPr>
@@ -133,7 +133,17 @@
                 <w:sz w:val="28"/>
                 <w:szCs w:val="28"/>
               </w:rPr>
-              <w:t xml:space="preserve">{{Branch}} </w:t>
+              <w:t>{{Branch</w:t>
+            </w:r>
+            <w:proofErr w:type="gramStart"/>
+            <w:r>
+              <w:rPr>
+                <w:rFonts w:ascii="Times New Roman" w:eastAsia="Times New Roman" w:hAnsi="Times New Roman" w:cs="Times New Roman"/>
+                <w:b/>
+                <w:sz w:val="28"/>
+                <w:szCs w:val="28"/>
+              </w:rPr>
+              <w:t xml:space="preserve">}} </w:t>
             </w:r>
             <w:r>
               <w:rPr>
@@ -151,6 +161,7 @@
               </w:rPr>
               <w:t xml:space="preserve"> </w:t>
             </w:r>
+            <w:proofErr w:type="gramEnd"/>
             <w:r>
               <w:rPr>
                 <w:rFonts w:ascii="Times New Roman" w:hAnsi="Times New Roman" w:cs="Times New Roman"/>
@@ -619,6 +630,7 @@
               </w:rPr>
               <w:t xml:space="preserve"> </w:t>
             </w:r>
+            <w:proofErr w:type="gramStart"/>
             <w:r>
               <w:rPr>
                 <w:rFonts w:ascii="Times New Roman" w:hAnsi="Times New Roman" w:cs="Times New Roman"/>
@@ -642,25 +654,77 @@
                 <w:sz w:val="26"/>
                 <w:szCs w:val="26"/>
               </w:rPr>
-              <w:t>Mr</w:t>
-            </w:r>
-            <w:r>
-              <w:rPr>
-                <w:rFonts w:ascii="Times New Roman" w:hAnsi="Times New Roman" w:cs="Times New Roman"/>
-                <w:b/>
-                <w:sz w:val="26"/>
-                <w:szCs w:val="26"/>
-              </w:rPr>
-              <w:t>.</w:t>
-            </w:r>
-            <w:r>
-              <w:rPr>
-                <w:rFonts w:ascii="Times New Roman" w:hAnsi="Times New Roman" w:cs="Times New Roman"/>
-                <w:b/>
-                <w:sz w:val="26"/>
-                <w:szCs w:val="26"/>
-              </w:rPr>
-              <w:t xml:space="preserve">{{BORROWER_NAME}} </w:t>
+              <w:t>{{</w:t>
+            </w:r>
+            <w:r>
+              <w:rPr>
+                <w:rFonts w:ascii="Times New Roman" w:hAnsi="Times New Roman" w:cs="Times New Roman"/>
+                <w:b/>
+                <w:sz w:val="24"/>
+                <w:szCs w:val="24"/>
+                <w:lang w:val="en-IN"/>
+              </w:rPr>
+              <w:t xml:space="preserve"> </w:t>
+            </w:r>
+            <w:r>
+              <w:rPr>
+                <w:rFonts w:ascii="Times New Roman" w:hAnsi="Times New Roman" w:cs="Times New Roman"/>
+                <w:b/>
+                <w:sz w:val="26"/>
+                <w:szCs w:val="26"/>
+                <w:lang w:val="en-IN"/>
+              </w:rPr>
+              <w:t>OWNER</w:t>
+            </w:r>
+            <w:proofErr w:type="gramEnd"/>
+            <w:r>
+              <w:rPr>
+                <w:rFonts w:ascii="Times New Roman" w:hAnsi="Times New Roman" w:cs="Times New Roman"/>
+                <w:b/>
+                <w:sz w:val="26"/>
+                <w:szCs w:val="26"/>
+                <w:lang w:val="en-IN"/>
+              </w:rPr>
+              <w:t>_</w:t>
+            </w:r>
+            <w:proofErr w:type="gramStart"/>
+            <w:r>
+              <w:rPr>
+                <w:rFonts w:ascii="Times New Roman" w:hAnsi="Times New Roman" w:cs="Times New Roman"/>
+                <w:b/>
+                <w:sz w:val="26"/>
+                <w:szCs w:val="26"/>
+                <w:lang w:val="en-IN"/>
+              </w:rPr>
+              <w:t>NAME</w:t>
+            </w:r>
+            <w:r>
+              <w:rPr>
+                <w:rFonts w:ascii="Times New Roman" w:hAnsi="Times New Roman" w:cs="Times New Roman"/>
+                <w:b/>
+                <w:sz w:val="26"/>
+                <w:szCs w:val="26"/>
+              </w:rPr>
+              <w:t xml:space="preserve"> </w:t>
+            </w:r>
+            <w:r>
+              <w:rPr>
+                <w:rFonts w:ascii="Times New Roman" w:hAnsi="Times New Roman" w:cs="Times New Roman"/>
+                <w:b/>
+                <w:sz w:val="26"/>
+                <w:szCs w:val="26"/>
+              </w:rPr>
+              <w:t>}</w:t>
+            </w:r>
+            <w:proofErr w:type="gramEnd"/>
+            <w:r>
+              <w:rPr>
+                <w:rFonts w:ascii="Times New Roman" w:hAnsi="Times New Roman" w:cs="Times New Roman"/>
+                <w:b/>
+                <w:sz w:val="26"/>
+                <w:szCs w:val="26"/>
+              </w:rPr>
+              <w:t xml:space="preserve">} </w:t>
             </w:r>
           </w:p>
           <w:p>
@@ -685,7 +749,16 @@
                 <w:sz w:val="26"/>
                 <w:szCs w:val="26"/>
               </w:rPr>
-              <w:t xml:space="preserve">–  </w:t>
+              <w:t>–</w:t>
+            </w:r>
+            <w:proofErr w:type="gramStart"/>
+            <w:r>
+              <w:rPr>
+                <w:rFonts w:ascii="Times New Roman" w:hAnsi="Times New Roman" w:cs="Times New Roman"/>
+                <w:sz w:val="26"/>
+                <w:szCs w:val="26"/>
+              </w:rPr>
+              <w:t xml:space="preserve">  </w:t>
             </w:r>
             <w:r>
               <w:rPr>
@@ -702,16 +775,17 @@
                 <w:sz w:val="26"/>
                 <w:szCs w:val="26"/>
               </w:rPr>
-              <w:t>Mr.</w:t>
-            </w:r>
-            <w:r>
-              <w:rPr>
-                <w:rFonts w:ascii="Times New Roman" w:hAnsi="Times New Roman" w:cs="Times New Roman"/>
-                <w:b/>
-                <w:sz w:val="26"/>
-                <w:szCs w:val="26"/>
-              </w:rPr>
-              <w:t xml:space="preserve">{{BORROWER_NAME}} </w:t>
+              <w:t>{</w:t>
+            </w:r>
+            <w:proofErr w:type="gramEnd"/>
+            <w:r>
+              <w:rPr>
+                <w:rFonts w:ascii="Times New Roman" w:hAnsi="Times New Roman" w:cs="Times New Roman"/>
+                <w:b/>
+                <w:sz w:val="26"/>
+                <w:szCs w:val="26"/>
+              </w:rPr>
+              <w:t xml:space="preserve">{BORROWER_NAME}} </w:t>
             </w:r>
           </w:p>
           <w:p>
@@ -1244,6 +1318,7 @@
                 <w:szCs w:val="26"/>
               </w:rPr>
             </w:pPr>
+            <w:proofErr w:type="gramStart"/>
             <w:r>
               <w:rPr>
                 <w:rFonts w:ascii="Times New Roman" w:hAnsi="Times New Roman" w:cs="Times New Roman"/>
@@ -1282,7 +1357,18 @@
                 <w:sz w:val="26"/>
                 <w:szCs w:val="26"/>
               </w:rPr>
-              <w:t>usand Hundred</w:t>
+              <w:t>usand</w:t>
+            </w:r>
+            <w:proofErr w:type="gramEnd"/>
+            <w:r>
+              <w:rPr>
+                <w:rFonts w:ascii="Times New Roman" w:hAnsi="Times New Roman" w:cs="Times New Roman"/>
+                <w:b/>
+                <w:i/>
+                <w:sz w:val="26"/>
+                <w:szCs w:val="26"/>
+              </w:rPr>
+              <w:t xml:space="preserve"> Hundred</w:t>
             </w:r>
             <w:r>
               <w:rPr>
@@ -1890,6 +1976,8 @@
           <w:szCs w:val="24"/>
         </w:rPr>
       </w:pPr>
+      <w:proofErr w:type="spellStart"/>
+      <w:proofErr w:type="gramStart"/>
       <w:r>
         <w:rPr>
           <w:rFonts w:ascii="Times New Roman" w:hAnsi="Times New Roman" w:cs="Times New Roman"/>
@@ -1898,8 +1986,10 @@
           <w:sz w:val="24"/>
           <w:szCs w:val="24"/>
         </w:rPr>
-        <w:t>B.ScEngg (Honrs),</w:t>
-      </w:r>
+        <w:t>B.ScEngg</w:t>
+      </w:r>
+      <w:proofErr w:type="spellEnd"/>
+      <w:proofErr w:type="gramEnd"/>
       <w:r>
         <w:rPr>
           <w:rFonts w:ascii="Times New Roman" w:hAnsi="Times New Roman" w:cs="Times New Roman"/>
@@ -1908,8 +1998,9 @@
           <w:sz w:val="24"/>
           <w:szCs w:val="24"/>
         </w:rPr>
-        <w:t xml:space="preserve"> </w:t>
-      </w:r>
+        <w:t xml:space="preserve"> (</w:t>
+      </w:r>
+      <w:proofErr w:type="spellStart"/>
       <w:r>
         <w:rPr>
           <w:rFonts w:ascii="Times New Roman" w:hAnsi="Times New Roman" w:cs="Times New Roman"/>
@@ -1918,8 +2009,9 @@
           <w:sz w:val="24"/>
           <w:szCs w:val="24"/>
         </w:rPr>
-        <w:t>MBA,</w:t>
-      </w:r>
+        <w:t>Honrs</w:t>
+      </w:r>
+      <w:proofErr w:type="spellEnd"/>
       <w:r>
         <w:rPr>
           <w:rFonts w:ascii="Times New Roman" w:hAnsi="Times New Roman" w:cs="Times New Roman"/>
@@ -1928,7 +2020,61 @@
           <w:sz w:val="24"/>
           <w:szCs w:val="24"/>
         </w:rPr>
-        <w:t xml:space="preserve"> Ph.D,</w:t>
+        <w:t>),</w:t>
+      </w:r>
+      <w:r>
+        <w:rPr>
+          <w:rFonts w:ascii="Times New Roman" w:hAnsi="Times New Roman" w:cs="Times New Roman"/>
+          <w:b/>
+          <w:color w:val="002060"/>
+          <w:sz w:val="24"/>
+          <w:szCs w:val="24"/>
+        </w:rPr>
+        <w:t xml:space="preserve"> </w:t>
+      </w:r>
+      <w:r>
+        <w:rPr>
+          <w:rFonts w:ascii="Times New Roman" w:hAnsi="Times New Roman" w:cs="Times New Roman"/>
+          <w:b/>
+          <w:color w:val="002060"/>
+          <w:sz w:val="24"/>
+          <w:szCs w:val="24"/>
+        </w:rPr>
+        <w:t>MBA,</w:t>
+      </w:r>
+      <w:r>
+        <w:rPr>
+          <w:rFonts w:ascii="Times New Roman" w:hAnsi="Times New Roman" w:cs="Times New Roman"/>
+          <w:b/>
+          <w:color w:val="002060"/>
+          <w:sz w:val="24"/>
+          <w:szCs w:val="24"/>
+        </w:rPr>
+        <w:t xml:space="preserve"> </w:t>
+      </w:r>
+      <w:proofErr w:type="spellStart"/>
+      <w:proofErr w:type="gramStart"/>
+      <w:r>
+        <w:rPr>
+          <w:rFonts w:ascii="Times New Roman" w:hAnsi="Times New Roman" w:cs="Times New Roman"/>
+          <w:b/>
+          <w:color w:val="002060"/>
+          <w:sz w:val="24"/>
+          <w:szCs w:val="24"/>
+        </w:rPr>
+        <w:t>Ph.D</w:t>
+      </w:r>
+      <w:proofErr w:type="spellEnd"/>
+      <w:proofErr w:type="gramEnd"/>
+      <w:r>
+        <w:rPr>
+          <w:rFonts w:ascii="Times New Roman" w:hAnsi="Times New Roman" w:cs="Times New Roman"/>
+          <w:b/>
+          <w:color w:val="002060"/>
+          <w:sz w:val="24"/>
+          <w:szCs w:val="24"/>
+        </w:rPr>
+        <w:t>,</w:t>
       </w:r>
       <w:r>
         <w:rPr>
@@ -2019,6 +2165,7 @@
         </w:rPr>
         <w:t xml:space="preserve">, </w:t>
       </w:r>
+      <w:proofErr w:type="gramStart"/>
       <w:r>
         <w:rPr>
           <w:rFonts w:ascii="Times New Roman" w:eastAsia="Times New Roman" w:hAnsi="Times New Roman" w:cs="Times New Roman"/>
@@ -2037,8 +2184,9 @@
           <w:sz w:val="24"/>
           <w:szCs w:val="24"/>
         </w:rPr>
-        <w:t xml:space="preserve">               </w:t>
-      </w:r>
+        <w:t xml:space="preserve"> </w:t>
+      </w:r>
+      <w:proofErr w:type="gramEnd"/>
       <w:r>
         <w:rPr>
           <w:rFonts w:ascii="Times New Roman" w:eastAsia="Times New Roman" w:hAnsi="Times New Roman" w:cs="Times New Roman"/>
@@ -2047,6 +2195,16 @@
           <w:sz w:val="24"/>
           <w:szCs w:val="24"/>
         </w:rPr>
+        <w:t xml:space="preserve">              </w:t>
+      </w:r>
+      <w:r>
+        <w:rPr>
+          <w:rFonts w:ascii="Times New Roman" w:eastAsia="Times New Roman" w:hAnsi="Times New Roman" w:cs="Times New Roman"/>
+          <w:b/>
+          <w:color w:val="FF0000"/>
+          <w:sz w:val="24"/>
+          <w:szCs w:val="24"/>
+        </w:rPr>
         <w:t xml:space="preserve"> </w:t>
       </w:r>
       <w:r>
@@ -2059,6 +2217,7 @@
         </w:rPr>
         <w:tab/>
       </w:r>
+      <w:proofErr w:type="gramStart"/>
       <w:r>
         <w:rPr>
           <w:rFonts w:ascii="Times New Roman" w:eastAsia="Times New Roman" w:hAnsi="Times New Roman" w:cs="Times New Roman"/>
@@ -2067,7 +2226,18 @@
           <w:sz w:val="24"/>
           <w:szCs w:val="24"/>
         </w:rPr>
-        <w:t>Souparnika,# 49/1183C</w:t>
+        <w:t>Souparnika,#</w:t>
+      </w:r>
+      <w:proofErr w:type="gramEnd"/>
+      <w:r>
+        <w:rPr>
+          <w:rFonts w:ascii="Times New Roman" w:eastAsia="Times New Roman" w:hAnsi="Times New Roman" w:cs="Times New Roman"/>
+          <w:b/>
+          <w:color w:val="FF0000"/>
+          <w:sz w:val="24"/>
+          <w:szCs w:val="24"/>
+        </w:rPr>
+        <w:t xml:space="preserve"> 49/1183C</w:t>
       </w:r>
     </w:p>
     <w:p>
@@ -2283,6 +2453,7 @@
           <w:szCs w:val="24"/>
         </w:rPr>
       </w:pPr>
+      <w:proofErr w:type="spellStart"/>
       <w:r>
         <w:rPr>
           <w:rFonts w:ascii="Times New Roman" w:eastAsia="Times New Roman" w:hAnsi="Times New Roman" w:cs="Times New Roman"/>
@@ -2291,7 +2462,18 @@
           <w:sz w:val="24"/>
           <w:szCs w:val="24"/>
         </w:rPr>
-        <w:t>Reg.Valuer - CBDT and IBBI.</w:t>
+        <w:t>Reg.Valuer</w:t>
+      </w:r>
+      <w:proofErr w:type="spellEnd"/>
+      <w:r>
+        <w:rPr>
+          <w:rFonts w:ascii="Times New Roman" w:eastAsia="Times New Roman" w:hAnsi="Times New Roman" w:cs="Times New Roman"/>
+          <w:b/>
+          <w:color w:val="000000" w:themeColor="text1"/>
+          <w:sz w:val="24"/>
+          <w:szCs w:val="24"/>
+        </w:rPr>
+        <w:t xml:space="preserve"> - CBDT and IBBI.</w:t>
       </w:r>
       <w:r>
         <w:rPr>
@@ -2900,7 +3082,17 @@
                 <w:sz w:val="28"/>
                 <w:szCs w:val="28"/>
               </w:rPr>
-              <w:t xml:space="preserve">{{Branch}} </w:t>
+              <w:t>{{Branch</w:t>
+            </w:r>
+            <w:proofErr w:type="gramStart"/>
+            <w:r>
+              <w:rPr>
+                <w:rFonts w:ascii="Times New Roman" w:eastAsia="Times New Roman" w:hAnsi="Times New Roman" w:cs="Times New Roman"/>
+                <w:b/>
+                <w:sz w:val="28"/>
+                <w:szCs w:val="28"/>
+              </w:rPr>
+              <w:t xml:space="preserve">}} </w:t>
             </w:r>
             <w:r>
               <w:rPr>
@@ -2919,6 +3111,7 @@
               </w:rPr>
               <w:t>Br</w:t>
             </w:r>
+            <w:proofErr w:type="gramEnd"/>
           </w:p>
         </w:tc>
       </w:tr>
@@ -2985,14 +3178,85 @@
               </w:rPr>
               <w:t xml:space="preserve"> </w:t>
             </w:r>
-            <w:r>
-              <w:rPr>
-                <w:rFonts w:ascii="Times New Roman" w:hAnsi="Times New Roman" w:cs="Times New Roman"/>
-                <w:b/>
-                <w:sz w:val="26"/>
-                <w:szCs w:val="26"/>
-              </w:rPr>
-              <w:t xml:space="preserve">{{BORROWER_NAME}} </w:t>
+            <w:proofErr w:type="gramStart"/>
+            <w:r>
+              <w:rPr>
+                <w:rFonts w:ascii="Times New Roman" w:hAnsi="Times New Roman" w:cs="Times New Roman"/>
+                <w:b/>
+                <w:sz w:val="26"/>
+                <w:szCs w:val="26"/>
+              </w:rPr>
+              <w:t>{{</w:t>
+            </w:r>
+            <w:r>
+              <w:rPr>
+                <w:rFonts w:ascii="Times New Roman" w:hAnsi="Times New Roman" w:cs="Times New Roman"/>
+                <w:b/>
+                <w:sz w:val="24"/>
+                <w:szCs w:val="24"/>
+                <w:lang w:val="en-IN"/>
+              </w:rPr>
+              <w:t xml:space="preserve"> </w:t>
+            </w:r>
+            <w:r>
+              <w:rPr>
+                <w:rFonts w:ascii="Times New Roman" w:hAnsi="Times New Roman" w:cs="Times New Roman"/>
+                <w:b/>
+                <w:sz w:val="26"/>
+                <w:szCs w:val="26"/>
+                <w:lang w:val="en-IN"/>
+              </w:rPr>
+              <w:t>OWNER</w:t>
+            </w:r>
+            <w:proofErr w:type="gramEnd"/>
+            <w:r>
+              <w:rPr>
+                <w:rFonts w:ascii="Times New Roman" w:hAnsi="Times New Roman" w:cs="Times New Roman"/>
+                <w:b/>
+                <w:sz w:val="26"/>
+                <w:szCs w:val="26"/>
+                <w:lang w:val="en-IN"/>
+              </w:rPr>
+              <w:t>_</w:t>
+            </w:r>
+            <w:proofErr w:type="gramStart"/>
+            <w:r>
+              <w:rPr>
+                <w:rFonts w:ascii="Times New Roman" w:hAnsi="Times New Roman" w:cs="Times New Roman"/>
+                <w:b/>
+                <w:sz w:val="26"/>
+                <w:szCs w:val="26"/>
+                <w:lang w:val="en-IN"/>
+              </w:rPr>
+              <w:t>NAME</w:t>
+            </w:r>
+            <w:r>
+              <w:rPr>
+                <w:rFonts w:ascii="Times New Roman" w:hAnsi="Times New Roman" w:cs="Times New Roman"/>
+                <w:b/>
+                <w:sz w:val="26"/>
+                <w:szCs w:val="26"/>
+              </w:rPr>
+              <w:t xml:space="preserve"> </w:t>
+            </w:r>
+            <w:r>
+              <w:rPr>
+                <w:rFonts w:ascii="Times New Roman" w:hAnsi="Times New Roman" w:cs="Times New Roman"/>
+                <w:b/>
+                <w:sz w:val="26"/>
+                <w:szCs w:val="26"/>
+              </w:rPr>
+              <w:t>}</w:t>
+            </w:r>
+            <w:proofErr w:type="gramEnd"/>
+            <w:r>
+              <w:rPr>
+                <w:rFonts w:ascii="Times New Roman" w:hAnsi="Times New Roman" w:cs="Times New Roman"/>
+                <w:b/>
+                <w:sz w:val="26"/>
+                <w:szCs w:val="26"/>
+              </w:rPr>
+              <w:t xml:space="preserve">} </w:t>
             </w:r>
           </w:p>
         </w:tc>
@@ -3409,35 +3673,28 @@
                 <w:sz w:val="26"/>
                 <w:szCs w:val="26"/>
               </w:rPr>
-              <w:t xml:space="preserve">{{EXTENT}} </w:t>
-            </w:r>
-            <w:r>
-              <w:rPr>
-                <w:rFonts w:ascii="Times New Roman" w:eastAsia="Times New Roman" w:hAnsi="Times New Roman" w:cs="Times New Roman"/>
-                <w:b/>
-                <w:sz w:val="26"/>
-                <w:szCs w:val="26"/>
-              </w:rPr>
-              <w:t xml:space="preserve">Ares = </w:t>
-            </w:r>
-            <w:r>
-              <w:rPr>
-                <w:rFonts w:ascii="Times New Roman" w:eastAsia="Times New Roman" w:hAnsi="Times New Roman" w:cs="Times New Roman"/>
-                <w:b/>
-                <w:sz w:val="26"/>
-                <w:szCs w:val="26"/>
-              </w:rPr>
-              <w:t xml:space="preserve">{{TOTAL_CENTS}}  </w:t>
-            </w:r>
-            <w:r>
-              <w:rPr>
-                <w:rFonts w:ascii="Times New Roman" w:eastAsia="Times New Roman" w:hAnsi="Times New Roman" w:cs="Times New Roman"/>
-                <w:b/>
-                <w:sz w:val="26"/>
-                <w:szCs w:val="26"/>
-              </w:rPr>
-              <w:t xml:space="preserve"> Cents</w:t>
-            </w:r>
+              <w:t>{{EXTENT</w:t>
+            </w:r>
+            <w:proofErr w:type="gramStart"/>
+            <w:r>
+              <w:rPr>
+                <w:rFonts w:ascii="Times New Roman" w:eastAsia="Times New Roman" w:hAnsi="Times New Roman" w:cs="Times New Roman"/>
+                <w:b/>
+                <w:sz w:val="26"/>
+                <w:szCs w:val="26"/>
+              </w:rPr>
+              <w:t xml:space="preserve">}} </w:t>
+            </w:r>
+            <w:r>
+              <w:rPr>
+                <w:rFonts w:ascii="Times New Roman" w:eastAsia="Times New Roman" w:hAnsi="Times New Roman" w:cs="Times New Roman"/>
+                <w:b/>
+                <w:sz w:val="26"/>
+                <w:szCs w:val="26"/>
+              </w:rPr>
+              <w:t xml:space="preserve"> =</w:t>
+            </w:r>
+            <w:proofErr w:type="gramEnd"/>
             <w:r>
               <w:rPr>
                 <w:rFonts w:ascii="Times New Roman" w:eastAsia="Times New Roman" w:hAnsi="Times New Roman" w:cs="Times New Roman"/>
@@ -3451,12 +3708,32 @@
               <w:rPr>
                 <w:rFonts w:ascii="Times New Roman" w:eastAsia="Times New Roman" w:hAnsi="Times New Roman" w:cs="Times New Roman"/>
                 <w:b/>
+                <w:sz w:val="26"/>
+                <w:szCs w:val="26"/>
+              </w:rPr>
+              <w:t>{{TOTAL_CENTS</w:t>
+            </w:r>
+            <w:proofErr w:type="gramStart"/>
+            <w:r>
+              <w:rPr>
+                <w:rFonts w:ascii="Times New Roman" w:eastAsia="Times New Roman" w:hAnsi="Times New Roman" w:cs="Times New Roman"/>
+                <w:b/>
+                <w:sz w:val="26"/>
+                <w:szCs w:val="26"/>
+              </w:rPr>
+              <w:t xml:space="preserve">}}  </w:t>
+            </w:r>
+            <w:r>
+              <w:rPr>
+                <w:rFonts w:ascii="Times New Roman" w:eastAsia="Times New Roman" w:hAnsi="Times New Roman" w:cs="Times New Roman"/>
+                <w:b/>
                 <w:bCs/>
                 <w:sz w:val="26"/>
                 <w:szCs w:val="26"/>
               </w:rPr>
-              <w:t xml:space="preserve">in </w:t>
-            </w:r>
+              <w:t>in</w:t>
+            </w:r>
+            <w:proofErr w:type="gramEnd"/>
             <w:r>
               <w:rPr>
                 <w:rFonts w:ascii="Times New Roman" w:eastAsia="Times New Roman" w:hAnsi="Times New Roman" w:cs="Times New Roman"/>
@@ -3475,6 +3752,16 @@
                 <w:sz w:val="26"/>
                 <w:szCs w:val="26"/>
               </w:rPr>
+              <w:t xml:space="preserve"> </w:t>
+            </w:r>
+            <w:r>
+              <w:rPr>
+                <w:rFonts w:ascii="Times New Roman" w:eastAsia="Times New Roman" w:hAnsi="Times New Roman" w:cs="Times New Roman"/>
+                <w:b/>
+                <w:bCs/>
+                <w:sz w:val="26"/>
+                <w:szCs w:val="26"/>
+              </w:rPr>
               <w:t xml:space="preserve">Sy. No. </w:t>
             </w:r>
             <w:r>
@@ -3495,7 +3782,25 @@
                 <w:sz w:val="26"/>
                 <w:szCs w:val="26"/>
               </w:rPr>
-              <w:t xml:space="preserve">with a </w:t>
+              <w:t xml:space="preserve"> </w:t>
+            </w:r>
+            <w:r>
+              <w:rPr>
+                <w:rFonts w:ascii="Times New Roman" w:eastAsia="Times New Roman" w:hAnsi="Times New Roman" w:cs="Times New Roman"/>
+                <w:sz w:val="26"/>
+                <w:szCs w:val="26"/>
+              </w:rPr>
+              <w:t>with a</w:t>
+            </w:r>
+            <w:r>
+              <w:rPr>
+                <w:rFonts w:ascii="Times New Roman" w:eastAsia="Times New Roman" w:hAnsi="Times New Roman" w:cs="Times New Roman"/>
+                <w:b/>
+                <w:bCs/>
+                <w:sz w:val="26"/>
+                <w:szCs w:val="26"/>
+              </w:rPr>
+              <w:t xml:space="preserve"> </w:t>
             </w:r>
             <w:r>
               <w:rPr>
@@ -3527,6 +3832,7 @@
               </w:rPr>
               <w:t>DOOR_NO</w:t>
             </w:r>
+            <w:proofErr w:type="gramStart"/>
             <w:r>
               <w:rPr>
                 <w:sz w:val="23"/>
@@ -3540,15 +3846,34 @@
                 <w:sz w:val="26"/>
                 <w:szCs w:val="26"/>
               </w:rPr>
-              <w:t xml:space="preserve">of </w:t>
-            </w:r>
-            <w:r>
-              <w:rPr>
-                <w:rFonts w:ascii="Times New Roman" w:eastAsia="Times New Roman" w:hAnsi="Times New Roman" w:cs="Times New Roman"/>
-                <w:sz w:val="26"/>
-                <w:szCs w:val="26"/>
-              </w:rPr>
-              <w:t>Piravom Municipality</w:t>
+              <w:t>of</w:t>
+            </w:r>
+            <w:proofErr w:type="gramEnd"/>
+            <w:r>
+              <w:rPr>
+                <w:rFonts w:ascii="Times New Roman" w:eastAsia="Times New Roman" w:hAnsi="Times New Roman" w:cs="Times New Roman"/>
+                <w:sz w:val="26"/>
+                <w:szCs w:val="26"/>
+              </w:rPr>
+              <w:t xml:space="preserve"> </w:t>
+            </w:r>
+            <w:proofErr w:type="spellStart"/>
+            <w:r>
+              <w:rPr>
+                <w:rFonts w:ascii="Times New Roman" w:eastAsia="Times New Roman" w:hAnsi="Times New Roman" w:cs="Times New Roman"/>
+                <w:sz w:val="26"/>
+                <w:szCs w:val="26"/>
+              </w:rPr>
+              <w:t>Piravom</w:t>
+            </w:r>
+            <w:proofErr w:type="spellEnd"/>
+            <w:r>
+              <w:rPr>
+                <w:rFonts w:ascii="Times New Roman" w:eastAsia="Times New Roman" w:hAnsi="Times New Roman" w:cs="Times New Roman"/>
+                <w:sz w:val="26"/>
+                <w:szCs w:val="26"/>
+              </w:rPr>
+              <w:t xml:space="preserve"> Municipality</w:t>
             </w:r>
             <w:r>
               <w:rPr>
@@ -3677,26 +4002,37 @@
                 <w:sz w:val="26"/>
                 <w:szCs w:val="26"/>
               </w:rPr>
-              <w:t xml:space="preserve">Ares = </w:t>
-            </w:r>
-            <w:r>
-              <w:rPr>
-                <w:rFonts w:ascii="Times New Roman" w:eastAsia="Times New Roman" w:hAnsi="Times New Roman" w:cs="Times New Roman"/>
-                <w:b/>
-                <w:sz w:val="26"/>
-                <w:szCs w:val="26"/>
-              </w:rPr>
-              <w:t xml:space="preserve">{{TOTAL_CENTS}}  </w:t>
-            </w:r>
-            <w:r>
-              <w:rPr>
-                <w:rFonts w:ascii="Times New Roman" w:eastAsia="Times New Roman" w:hAnsi="Times New Roman" w:cs="Times New Roman"/>
-                <w:b/>
-                <w:sz w:val="26"/>
-                <w:szCs w:val="26"/>
-              </w:rPr>
-              <w:t xml:space="preserve"> Cents</w:t>
-            </w:r>
+              <w:t xml:space="preserve">= </w:t>
+            </w:r>
+            <w:r>
+              <w:rPr>
+                <w:rFonts w:ascii="Times New Roman" w:eastAsia="Times New Roman" w:hAnsi="Times New Roman" w:cs="Times New Roman"/>
+                <w:b/>
+                <w:sz w:val="26"/>
+                <w:szCs w:val="26"/>
+              </w:rPr>
+              <w:t>{{TOTAL_CENTS</w:t>
+            </w:r>
+            <w:proofErr w:type="gramStart"/>
+            <w:r>
+              <w:rPr>
+                <w:rFonts w:ascii="Times New Roman" w:eastAsia="Times New Roman" w:hAnsi="Times New Roman" w:cs="Times New Roman"/>
+                <w:b/>
+                <w:sz w:val="26"/>
+                <w:szCs w:val="26"/>
+              </w:rPr>
+              <w:t xml:space="preserve">}}  </w:t>
+            </w:r>
+            <w:r>
+              <w:rPr>
+                <w:rFonts w:ascii="Times New Roman" w:eastAsia="Times New Roman" w:hAnsi="Times New Roman" w:cs="Times New Roman"/>
+                <w:b/>
+                <w:sz w:val="26"/>
+                <w:szCs w:val="26"/>
+              </w:rPr>
+              <w:t xml:space="preserve"> </w:t>
+            </w:r>
+            <w:proofErr w:type="gramEnd"/>
           </w:p>
         </w:tc>
       </w:tr>
@@ -5279,6 +5615,7 @@
                 <w:szCs w:val="26"/>
               </w:rPr>
             </w:pPr>
+            <w:proofErr w:type="gramStart"/>
             <w:r>
               <w:rPr>
                 <w:rFonts w:ascii="Times New Roman" w:hAnsi="Times New Roman" w:cs="Times New Roman"/>
@@ -5295,6 +5632,7 @@
               </w:rPr>
               <w:t xml:space="preserve">  Deed</w:t>
             </w:r>
+            <w:proofErr w:type="gramEnd"/>
             <w:r>
               <w:rPr>
                 <w:rFonts w:ascii="Times New Roman" w:eastAsia="Times New Roman" w:hAnsi="Times New Roman" w:cs="Times New Roman"/>
@@ -5302,22 +5640,6 @@
                 <w:szCs w:val="26"/>
               </w:rPr>
               <w:t xml:space="preserve"> No. </w:t>
-            </w:r>
-            <w:r>
-              <w:rPr>
-                <w:rFonts w:ascii="Times New Roman" w:eastAsia="Times New Roman" w:hAnsi="Times New Roman" w:cs="Times New Roman"/>
-                <w:sz w:val="26"/>
-                <w:szCs w:val="26"/>
-              </w:rPr>
-              <w:t>2509/94</w:t>
-            </w:r>
-            <w:r>
-              <w:rPr>
-                <w:rFonts w:ascii="Times New Roman" w:eastAsia="Times New Roman" w:hAnsi="Times New Roman" w:cs="Times New Roman"/>
-                <w:sz w:val="26"/>
-                <w:szCs w:val="26"/>
-              </w:rPr>
-              <w:t xml:space="preserve"> </w:t>
             </w:r>
           </w:p>
           <w:p>
@@ -5394,15 +5716,15 @@
                 <w:sz w:val="26"/>
                 <w:szCs w:val="26"/>
               </w:rPr>
-              <w:t xml:space="preserve"> Residential &amp;</w:t>
-            </w:r>
-            <w:r>
-              <w:rPr>
-                <w:rFonts w:ascii="Times New Roman" w:eastAsia="Times New Roman" w:hAnsi="Times New Roman" w:cs="Times New Roman"/>
-                <w:sz w:val="26"/>
-                <w:szCs w:val="26"/>
-              </w:rPr>
-              <w:t>Commercial plot</w:t>
+              <w:t xml:space="preserve"> Residential </w:t>
+            </w:r>
+            <w:r>
+              <w:rPr>
+                <w:rFonts w:ascii="Times New Roman" w:eastAsia="Times New Roman" w:hAnsi="Times New Roman" w:cs="Times New Roman"/>
+                <w:sz w:val="26"/>
+                <w:szCs w:val="26"/>
+              </w:rPr>
+              <w:t>plot</w:t>
             </w:r>
           </w:p>
         </w:tc>
@@ -5613,8 +5935,18 @@
                 <w:sz w:val="26"/>
                 <w:szCs w:val="26"/>
               </w:rPr>
-              <w:t>Mud Masonary</w:t>
-            </w:r>
+              <w:t xml:space="preserve">Mud </w:t>
+            </w:r>
+            <w:proofErr w:type="spellStart"/>
+            <w:r>
+              <w:rPr>
+                <w:rFonts w:ascii="Times New Roman" w:eastAsia="Times New Roman" w:hAnsi="Times New Roman" w:cs="Times New Roman"/>
+                <w:sz w:val="26"/>
+                <w:szCs w:val="26"/>
+              </w:rPr>
+              <w:t>Masonary</w:t>
+            </w:r>
+            <w:proofErr w:type="spellEnd"/>
           </w:p>
         </w:tc>
       </w:tr>
@@ -5868,7 +6200,25 @@
                 <w:sz w:val="26"/>
                 <w:szCs w:val="26"/>
               </w:rPr>
-              <w:t>All civic amenities are available within  a short distance.</w:t>
+              <w:t xml:space="preserve">All civic amenities are available </w:t>
+            </w:r>
+            <w:proofErr w:type="gramStart"/>
+            <w:r>
+              <w:rPr>
+                <w:rFonts w:ascii="Times New Roman" w:hAnsi="Times New Roman" w:cs="Times New Roman"/>
+                <w:sz w:val="26"/>
+                <w:szCs w:val="26"/>
+              </w:rPr>
+              <w:t>within  a</w:t>
+            </w:r>
+            <w:proofErr w:type="gramEnd"/>
+            <w:r>
+              <w:rPr>
+                <w:rFonts w:ascii="Times New Roman" w:hAnsi="Times New Roman" w:cs="Times New Roman"/>
+                <w:sz w:val="26"/>
+                <w:szCs w:val="26"/>
+              </w:rPr>
+              <w:t xml:space="preserve"> short distance.</w:t>
             </w:r>
           </w:p>
         </w:tc>
@@ -6094,16 +6444,7 @@
                 <w:sz w:val="26"/>
                 <w:szCs w:val="26"/>
               </w:rPr>
-              <w:t xml:space="preserve">c) If any recent transaction in the neighborhood has taken place, give date, Registration number, and extent of property and consideration of the transaction. Also state </w:t>
-            </w:r>
-            <w:r>
-              <w:rPr>
-                <w:rFonts w:ascii="Times New Roman" w:eastAsia="Times New Roman" w:hAnsi="Times New Roman" w:cs="Times New Roman"/>
-                <w:sz w:val="26"/>
-                <w:szCs w:val="26"/>
-              </w:rPr>
-              <w:lastRenderedPageBreak/>
-              <w:t>how the said property compares with the present property under valuation.</w:t>
+              <w:t>c) If any recent transaction in the neighborhood has taken place, give date, Registration number, and extent of property and consideration of the transaction. Also state how the said property compares with the present property under valuation.</w:t>
             </w:r>
           </w:p>
           <w:p>
@@ -6200,16 +6541,34 @@
                 <w:sz w:val="26"/>
                 <w:szCs w:val="26"/>
               </w:rPr>
-              <w:lastRenderedPageBreak/>
-              <w:t xml:space="preserve">{{TOTAL_CENTS}}  </w:t>
-            </w:r>
-            <w:r>
-              <w:rPr>
-                <w:rFonts w:ascii="Times New Roman" w:hAnsi="Times New Roman" w:cs="Times New Roman"/>
-                <w:sz w:val="26"/>
-                <w:szCs w:val="26"/>
-              </w:rPr>
-              <w:t xml:space="preserve">Cents </w:t>
+              <w:t>{{TOTAL_CENTS</w:t>
+            </w:r>
+            <w:proofErr w:type="gramStart"/>
+            <w:r>
+              <w:rPr>
+                <w:rFonts w:ascii="Times New Roman" w:eastAsia="Times New Roman" w:hAnsi="Times New Roman" w:cs="Times New Roman"/>
+                <w:b/>
+                <w:sz w:val="26"/>
+                <w:szCs w:val="26"/>
+              </w:rPr>
+              <w:t xml:space="preserve">}}  </w:t>
+            </w:r>
+            <w:r>
+              <w:rPr>
+                <w:rFonts w:ascii="Times New Roman" w:hAnsi="Times New Roman" w:cs="Times New Roman"/>
+                <w:sz w:val="26"/>
+                <w:szCs w:val="26"/>
+              </w:rPr>
+              <w:t>Cents</w:t>
+            </w:r>
+            <w:proofErr w:type="gramEnd"/>
+            <w:r>
+              <w:rPr>
+                <w:rFonts w:ascii="Times New Roman" w:hAnsi="Times New Roman" w:cs="Times New Roman"/>
+                <w:sz w:val="26"/>
+                <w:szCs w:val="26"/>
+              </w:rPr>
+              <w:t xml:space="preserve"> </w:t>
             </w:r>
             <w:r>
               <w:rPr>
@@ -6457,6 +6816,7 @@
               </w:rPr>
               <w:t>LAND_RATE_PER_CENT</w:t>
             </w:r>
+            <w:proofErr w:type="gramStart"/>
             <w:r>
               <w:rPr>
                 <w:rFonts w:ascii="Times New Roman" w:hAnsi="Times New Roman" w:cs="Times New Roman"/>
@@ -6481,13 +6841,14 @@
               </w:rPr>
               <w:t xml:space="preserve">  </w:t>
             </w:r>
-            <w:r>
-              <w:rPr>
-                <w:rFonts w:ascii="Times New Roman" w:hAnsi="Times New Roman" w:cs="Times New Roman"/>
-                <w:sz w:val="26"/>
-                <w:szCs w:val="26"/>
-              </w:rPr>
-              <w:t xml:space="preserve"> per cent </w:t>
+            <w:proofErr w:type="gramEnd"/>
+            <w:r>
+              <w:rPr>
+                <w:rFonts w:ascii="Times New Roman" w:hAnsi="Times New Roman" w:cs="Times New Roman"/>
+                <w:sz w:val="26"/>
+                <w:szCs w:val="26"/>
+              </w:rPr>
+              <w:t xml:space="preserve">per cent </w:t>
             </w:r>
             <w:r>
               <w:rPr>
@@ -6631,7 +6992,6 @@
                 <w:sz w:val="26"/>
                 <w:szCs w:val="26"/>
               </w:rPr>
-              <w:lastRenderedPageBreak/>
               <w:t xml:space="preserve">   </w:t>
             </w:r>
           </w:p>
@@ -6778,7 +7138,6 @@
                 <w:sz w:val="26"/>
                 <w:szCs w:val="26"/>
               </w:rPr>
-              <w:lastRenderedPageBreak/>
               <w:t>24. Realizable value of the property</w:t>
             </w:r>
           </w:p>
@@ -7141,6 +7500,7 @@
                 <w:lang w:val="en-IN"/>
               </w:rPr>
             </w:pPr>
+            <w:proofErr w:type="spellStart"/>
             <w:r>
               <w:rPr>
                 <w:rFonts w:ascii="Times New Roman" w:eastAsia="Times New Roman" w:hAnsi="Times New Roman" w:cs="Times New Roman"/>
@@ -7149,6 +7509,7 @@
               </w:rPr>
               <w:t>Asingle</w:t>
             </w:r>
+            <w:proofErr w:type="spellEnd"/>
             <w:r>
               <w:rPr>
                 <w:rFonts w:ascii="Times New Roman" w:eastAsia="Times New Roman" w:hAnsi="Times New Roman" w:cs="Times New Roman"/>
@@ -7179,7 +7540,16 @@
                 <w:sz w:val="26"/>
                 <w:szCs w:val="26"/>
               </w:rPr>
-              <w:t xml:space="preserve"> building</w:t>
+              <w:t xml:space="preserve"> </w:t>
+            </w:r>
+            <w:proofErr w:type="gramStart"/>
+            <w:r>
+              <w:rPr>
+                <w:rFonts w:ascii="Times New Roman" w:eastAsia="Times New Roman" w:hAnsi="Times New Roman" w:cs="Times New Roman"/>
+                <w:sz w:val="26"/>
+                <w:szCs w:val="26"/>
+              </w:rPr>
+              <w:t>building</w:t>
             </w:r>
             <w:r>
               <w:rPr>
@@ -7209,6 +7579,7 @@
               </w:rPr>
               <w:t>in</w:t>
             </w:r>
+            <w:proofErr w:type="gramEnd"/>
             <w:r>
               <w:rPr>
                 <w:rFonts w:ascii="Times New Roman" w:eastAsia="Times New Roman" w:hAnsi="Times New Roman" w:cs="Times New Roman"/>
@@ -7274,7 +7645,16 @@
                 <w:sz w:val="26"/>
                 <w:szCs w:val="26"/>
               </w:rPr>
-              <w:t xml:space="preserve"> in </w:t>
+              <w:t xml:space="preserve"> in</w:t>
+            </w:r>
+            <w:proofErr w:type="gramStart"/>
+            <w:r>
+              <w:rPr>
+                <w:rFonts w:ascii="Times New Roman" w:eastAsia="Times New Roman" w:hAnsi="Times New Roman" w:cs="Times New Roman"/>
+                <w:sz w:val="26"/>
+                <w:szCs w:val="26"/>
+              </w:rPr>
+              <w:t xml:space="preserve"> </w:t>
             </w:r>
             <w:r>
               <w:rPr>
@@ -7293,7 +7673,16 @@
                 <w:sz w:val="24"/>
                 <w:szCs w:val="24"/>
               </w:rPr>
-              <w:t>{{</w:t>
+              <w:t>{</w:t>
+            </w:r>
+            <w:proofErr w:type="gramEnd"/>
+            <w:r>
+              <w:rPr>
+                <w:rFonts w:ascii="Times New Roman" w:eastAsia="Times New Roman" w:hAnsi="Times New Roman" w:cs="Times New Roman"/>
+                <w:sz w:val="24"/>
+                <w:szCs w:val="24"/>
+              </w:rPr>
+              <w:t>{</w:t>
             </w:r>
             <w:r>
               <w:rPr>
@@ -7447,6 +7836,7 @@
               </w:rPr>
               <w:t>DOOR_NO</w:t>
             </w:r>
+            <w:proofErr w:type="gramStart"/>
             <w:r>
               <w:rPr>
                 <w:sz w:val="23"/>
@@ -7460,8 +7850,9 @@
                 <w:sz w:val="26"/>
                 <w:szCs w:val="26"/>
               </w:rPr>
-              <w:t xml:space="preserve">of </w:t>
-            </w:r>
+              <w:t>of</w:t>
+            </w:r>
+            <w:proofErr w:type="gramEnd"/>
             <w:r>
               <w:rPr>
                 <w:rFonts w:ascii="Times New Roman" w:eastAsia="Times New Roman" w:hAnsi="Times New Roman" w:cs="Times New Roman"/>
@@ -7476,7 +7867,25 @@
                 <w:sz w:val="26"/>
                 <w:szCs w:val="26"/>
               </w:rPr>
-              <w:t>Piravom Municipality</w:t>
+              <w:t xml:space="preserve"> </w:t>
+            </w:r>
+            <w:proofErr w:type="spellStart"/>
+            <w:r>
+              <w:rPr>
+                <w:rFonts w:ascii="Times New Roman" w:eastAsia="Times New Roman" w:hAnsi="Times New Roman" w:cs="Times New Roman"/>
+                <w:sz w:val="26"/>
+                <w:szCs w:val="26"/>
+              </w:rPr>
+              <w:t>Piravom</w:t>
+            </w:r>
+            <w:proofErr w:type="spellEnd"/>
+            <w:r>
+              <w:rPr>
+                <w:rFonts w:ascii="Times New Roman" w:eastAsia="Times New Roman" w:hAnsi="Times New Roman" w:cs="Times New Roman"/>
+                <w:sz w:val="26"/>
+                <w:szCs w:val="26"/>
+              </w:rPr>
+              <w:t xml:space="preserve"> Municipality</w:t>
             </w:r>
           </w:p>
         </w:tc>
@@ -7597,8 +8006,9 @@
                 <w:sz w:val="26"/>
                 <w:szCs w:val="26"/>
               </w:rPr>
-              <w:t xml:space="preserve"> Cum </w:t>
-            </w:r>
+              <w:t xml:space="preserve"> </w:t>
+            </w:r>
+            <w:proofErr w:type="gramStart"/>
             <w:r>
               <w:rPr>
                 <w:rFonts w:ascii="Times New Roman" w:eastAsia="Times New Roman" w:hAnsi="Times New Roman" w:cs="Times New Roman"/>
@@ -7607,8 +8017,19 @@
                 <w:sz w:val="26"/>
                 <w:szCs w:val="26"/>
               </w:rPr>
+              <w:t xml:space="preserve">Cum </w:t>
+            </w:r>
+            <w:r>
+              <w:rPr>
+                <w:rFonts w:ascii="Times New Roman" w:eastAsia="Times New Roman" w:hAnsi="Times New Roman" w:cs="Times New Roman"/>
+                <w:b/>
+                <w:bCs/>
+                <w:sz w:val="26"/>
+                <w:szCs w:val="26"/>
+              </w:rPr>
               <w:t xml:space="preserve"> Commercial</w:t>
             </w:r>
+            <w:proofErr w:type="gramEnd"/>
             <w:r>
               <w:rPr>
                 <w:rFonts w:ascii="Times New Roman" w:hAnsi="Times New Roman" w:cs="Times New Roman"/>
@@ -7698,22 +8119,42 @@
                 <w:szCs w:val="26"/>
               </w:rPr>
             </w:pPr>
-            <w:r>
-              <w:rPr>
-                <w:rFonts w:ascii="Times New Roman" w:eastAsia="Times New Roman" w:hAnsi="Times New Roman" w:cs="Times New Roman"/>
-                <w:sz w:val="26"/>
-                <w:szCs w:val="26"/>
-              </w:rPr>
-              <w:t>Viritified Tiles</w:t>
-            </w:r>
-            <w:r>
-              <w:rPr>
-                <w:rFonts w:ascii="Times New Roman" w:eastAsia="Times New Roman" w:hAnsi="Times New Roman" w:cs="Times New Roman"/>
-                <w:sz w:val="26"/>
-                <w:szCs w:val="26"/>
-              </w:rPr>
-              <w:t xml:space="preserve"> &amp; Mossaic</w:t>
-            </w:r>
+            <w:proofErr w:type="spellStart"/>
+            <w:r>
+              <w:rPr>
+                <w:rFonts w:ascii="Times New Roman" w:eastAsia="Times New Roman" w:hAnsi="Times New Roman" w:cs="Times New Roman"/>
+                <w:sz w:val="26"/>
+                <w:szCs w:val="26"/>
+              </w:rPr>
+              <w:t>Viritified</w:t>
+            </w:r>
+            <w:proofErr w:type="spellEnd"/>
+            <w:r>
+              <w:rPr>
+                <w:rFonts w:ascii="Times New Roman" w:eastAsia="Times New Roman" w:hAnsi="Times New Roman" w:cs="Times New Roman"/>
+                <w:sz w:val="26"/>
+                <w:szCs w:val="26"/>
+              </w:rPr>
+              <w:t xml:space="preserve"> Tiles</w:t>
+            </w:r>
+            <w:r>
+              <w:rPr>
+                <w:rFonts w:ascii="Times New Roman" w:eastAsia="Times New Roman" w:hAnsi="Times New Roman" w:cs="Times New Roman"/>
+                <w:sz w:val="26"/>
+                <w:szCs w:val="26"/>
+              </w:rPr>
+              <w:t xml:space="preserve"> &amp; </w:t>
+            </w:r>
+            <w:proofErr w:type="spellStart"/>
+            <w:r>
+              <w:rPr>
+                <w:rFonts w:ascii="Times New Roman" w:eastAsia="Times New Roman" w:hAnsi="Times New Roman" w:cs="Times New Roman"/>
+                <w:sz w:val="26"/>
+                <w:szCs w:val="26"/>
+              </w:rPr>
+              <w:t>Mossaic</w:t>
+            </w:r>
+            <w:proofErr w:type="spellEnd"/>
           </w:p>
         </w:tc>
       </w:tr>
@@ -8271,6 +8712,7 @@
               </w:rPr>
               <w:t xml:space="preserve">}} </w:t>
             </w:r>
+            <w:proofErr w:type="spellStart"/>
             <w:r>
               <w:rPr>
                 <w:rFonts w:ascii="Times New Roman" w:eastAsia="Times New Roman" w:hAnsi="Times New Roman" w:cs="Times New Roman"/>
@@ -8281,6 +8723,7 @@
               </w:rPr>
               <w:t>sqft</w:t>
             </w:r>
+            <w:proofErr w:type="spellEnd"/>
             <w:r>
               <w:rPr>
                 <w:rFonts w:ascii="Times New Roman" w:eastAsia="Times New Roman" w:hAnsi="Times New Roman" w:cs="Times New Roman"/>
@@ -8291,6 +8734,7 @@
               </w:rPr>
               <w:t xml:space="preserve"> </w:t>
             </w:r>
+            <w:proofErr w:type="gramStart"/>
             <w:r>
               <w:rPr>
                 <w:rFonts w:ascii="Times New Roman" w:eastAsia="Times New Roman" w:hAnsi="Times New Roman" w:cs="Times New Roman"/>
@@ -8309,8 +8753,9 @@
                 <w:sz w:val="26"/>
                 <w:szCs w:val="26"/>
               </w:rPr>
-              <w:t xml:space="preserve">  {{</w:t>
-            </w:r>
+              <w:t xml:space="preserve">  {</w:t>
+            </w:r>
+            <w:proofErr w:type="gramEnd"/>
             <w:r>
               <w:rPr>
                 <w:rFonts w:ascii="Times New Roman" w:eastAsia="Times New Roman" w:hAnsi="Times New Roman" w:cs="Times New Roman"/>
@@ -8318,6 +8763,16 @@
                 <w:bCs/>
                 <w:sz w:val="26"/>
                 <w:szCs w:val="26"/>
+              </w:rPr>
+              <w:t>{</w:t>
+            </w:r>
+            <w:r>
+              <w:rPr>
+                <w:rFonts w:ascii="Times New Roman" w:eastAsia="Times New Roman" w:hAnsi="Times New Roman" w:cs="Times New Roman"/>
+                <w:b/>
+                <w:bCs/>
+                <w:sz w:val="26"/>
+                <w:szCs w:val="26"/>
                 <w:lang w:val="en-IN"/>
               </w:rPr>
               <w:t>BRPS</w:t>
@@ -8333,6 +8788,7 @@
               </w:rPr>
               <w:t xml:space="preserve">}} </w:t>
             </w:r>
+            <w:proofErr w:type="spellStart"/>
             <w:r>
               <w:rPr>
                 <w:rFonts w:ascii="Times New Roman" w:eastAsia="Times New Roman" w:hAnsi="Times New Roman" w:cs="Times New Roman"/>
@@ -8341,8 +8797,9 @@
                 <w:sz w:val="26"/>
                 <w:szCs w:val="26"/>
               </w:rPr>
-              <w:t>sqft=</w:t>
-            </w:r>
+              <w:t>sqft</w:t>
+            </w:r>
+            <w:proofErr w:type="spellEnd"/>
             <w:r>
               <w:rPr>
                 <w:rFonts w:ascii="Times New Roman" w:eastAsia="Times New Roman" w:hAnsi="Times New Roman" w:cs="Times New Roman"/>
@@ -8351,6 +8808,16 @@
                 <w:sz w:val="26"/>
                 <w:szCs w:val="26"/>
               </w:rPr>
+              <w:t>=</w:t>
+            </w:r>
+            <w:r>
+              <w:rPr>
+                <w:rFonts w:ascii="Times New Roman" w:eastAsia="Times New Roman" w:hAnsi="Times New Roman" w:cs="Times New Roman"/>
+                <w:b/>
+                <w:bCs/>
+                <w:sz w:val="26"/>
+                <w:szCs w:val="26"/>
+              </w:rPr>
               <w:t>{{</w:t>
             </w:r>
             <w:r>
@@ -8362,7 +8829,7 @@
                 <w:szCs w:val="26"/>
                 <w:lang w:val="en-IN"/>
               </w:rPr>
-              <w:t>BUILDING_MARKET_VALUE</w:t>
+              <w:t>BUILDING_GROSS_VALUE</w:t>
             </w:r>
             <w:r>
               <w:rPr>
@@ -8638,7 +9105,6 @@
                 <w:sz w:val="26"/>
                 <w:szCs w:val="26"/>
               </w:rPr>
-              <w:lastRenderedPageBreak/>
               <w:t>/-</w:t>
             </w:r>
           </w:p>
@@ -8664,8 +9130,16 @@
                 <w:sz w:val="26"/>
                 <w:szCs w:val="26"/>
               </w:rPr>
-              <w:lastRenderedPageBreak/>
-              <w:t xml:space="preserve">41. Taking into consideration the above facts, valuation of building fixed by </w:t>
+              <w:t xml:space="preserve">41. Taking into consideration the above facts, valuation of building fixed </w:t>
+            </w:r>
+            <w:proofErr w:type="gramStart"/>
+            <w:r>
+              <w:rPr>
+                <w:rFonts w:ascii="Times New Roman" w:eastAsia="Times New Roman" w:hAnsi="Times New Roman" w:cs="Times New Roman"/>
+                <w:sz w:val="26"/>
+                <w:szCs w:val="26"/>
+              </w:rPr>
+              <w:t xml:space="preserve">by </w:t>
             </w:r>
             <w:r>
               <w:rPr>
@@ -8683,6 +9157,7 @@
               </w:rPr>
               <w:t>valuer</w:t>
             </w:r>
+            <w:proofErr w:type="gramEnd"/>
           </w:p>
         </w:tc>
         <w:tc>
@@ -9102,7 +9577,7 @@
           <w:sz w:val="26"/>
           <w:szCs w:val="26"/>
         </w:rPr>
-        <w:t xml:space="preserve">BUILDING </w:t>
+        <w:t>BUILDIN</w:t>
       </w:r>
       <w:r>
         <w:rPr>
@@ -9179,16 +9654,37 @@
           <w:szCs w:val="26"/>
           <w:lang w:val="en-IN"/>
         </w:rPr>
-        <w:t>REALIZABLE_VALUE_WORDS}}</w:t>
-      </w:r>
-      <w:r>
-        <w:rPr>
-          <w:rFonts w:ascii="Times New Roman" w:eastAsia="Times New Roman" w:hAnsi="Times New Roman" w:cs="Times New Roman"/>
-          <w:b/>
-          <w:sz w:val="26"/>
-          <w:szCs w:val="26"/>
-        </w:rPr>
-        <w:t>Only)</w:t>
+        <w:t>REALIZABLE_VALUE_WORDS</w:t>
+      </w:r>
+      <w:proofErr w:type="gramStart"/>
+      <w:r>
+        <w:rPr>
+          <w:rFonts w:ascii="Times New Roman" w:eastAsia="Times New Roman" w:hAnsi="Times New Roman" w:cs="Times New Roman"/>
+          <w:b/>
+          <w:sz w:val="26"/>
+          <w:szCs w:val="26"/>
+          <w:lang w:val="en-IN"/>
+        </w:rPr>
+        <w:t>}}</w:t>
+      </w:r>
+      <w:r>
+        <w:rPr>
+          <w:rFonts w:ascii="Times New Roman" w:eastAsia="Times New Roman" w:hAnsi="Times New Roman" w:cs="Times New Roman"/>
+          <w:b/>
+          <w:sz w:val="26"/>
+          <w:szCs w:val="26"/>
+        </w:rPr>
+        <w:t>Only</w:t>
+      </w:r>
+      <w:proofErr w:type="gramEnd"/>
+      <w:r>
+        <w:rPr>
+          <w:rFonts w:ascii="Times New Roman" w:eastAsia="Times New Roman" w:hAnsi="Times New Roman" w:cs="Times New Roman"/>
+          <w:b/>
+          <w:sz w:val="26"/>
+          <w:szCs w:val="26"/>
+        </w:rPr>
+        <w:t>)</w:t>
       </w:r>
     </w:p>
     <w:p>
@@ -10364,8 +10860,9 @@
           <w:sz w:val="26"/>
           <w:szCs w:val="26"/>
         </w:rPr>
-        <w:t xml:space="preserve">{{BORROWER_NAME}} </w:t>
-      </w:r>
+        <w:t>{{BORROWER_NAME}</w:t>
+      </w:r>
+      <w:proofErr w:type="gramStart"/>
       <w:r>
         <w:rPr>
           <w:rFonts w:ascii="Times New Roman" w:hAnsi="Times New Roman" w:cs="Times New Roman"/>
@@ -10373,8 +10870,18 @@
           <w:sz w:val="26"/>
           <w:szCs w:val="26"/>
         </w:rPr>
+        <w:t xml:space="preserve">} </w:t>
+      </w:r>
+      <w:r>
+        <w:rPr>
+          <w:rFonts w:ascii="Times New Roman" w:hAnsi="Times New Roman" w:cs="Times New Roman"/>
+          <w:b/>
+          <w:sz w:val="26"/>
+          <w:szCs w:val="26"/>
+        </w:rPr>
         <w:t>.</w:t>
       </w:r>
+      <w:proofErr w:type="gramEnd"/>
       <w:r>
         <w:rPr>
           <w:rFonts w:ascii="Times New Roman" w:eastAsia="Times New Roman" w:hAnsi="Times New Roman" w:cs="Times New Roman"/>
@@ -10384,6 +10891,7 @@
         </w:rPr>
         <w:t xml:space="preserve"> </w:t>
       </w:r>
+      <w:proofErr w:type="gramStart"/>
       <w:r>
         <w:rPr>
           <w:rFonts w:ascii="Times New Roman" w:eastAsia="Times New Roman" w:hAnsi="Times New Roman" w:cs="Times New Roman"/>
@@ -10409,7 +10917,17 @@
           <w:sz w:val="26"/>
           <w:szCs w:val="26"/>
         </w:rPr>
-        <w:t>{{</w:t>
+        <w:t>{</w:t>
+      </w:r>
+      <w:proofErr w:type="gramEnd"/>
+      <w:r>
+        <w:rPr>
+          <w:rFonts w:ascii="Times New Roman" w:eastAsia="Times New Roman" w:hAnsi="Times New Roman" w:cs="Times New Roman"/>
+          <w:b/>
+          <w:sz w:val="26"/>
+          <w:szCs w:val="26"/>
+        </w:rPr>
+        <w:t>{</w:t>
       </w:r>
       <w:r>
         <w:rPr>
@@ -10480,6 +10998,7 @@
         </w:rPr>
         <w:t xml:space="preserve">}} </w:t>
       </w:r>
+      <w:proofErr w:type="gramStart"/>
       <w:r>
         <w:rPr>
           <w:rFonts w:ascii="Times New Roman" w:eastAsia="Times New Roman" w:hAnsi="Times New Roman" w:cs="Times New Roman"/>
@@ -10498,7 +11017,18 @@
           <w:szCs w:val="26"/>
           <w:lang w:val="en-IN"/>
         </w:rPr>
-        <w:t xml:space="preserve"> {{TALUK}}</w:t>
+        <w:t xml:space="preserve"> {</w:t>
+      </w:r>
+      <w:proofErr w:type="gramEnd"/>
+      <w:r>
+        <w:rPr>
+          <w:rFonts w:ascii="Times New Roman" w:eastAsia="Times New Roman" w:hAnsi="Times New Roman" w:cs="Times New Roman"/>
+          <w:b/>
+          <w:sz w:val="26"/>
+          <w:szCs w:val="26"/>
+          <w:lang w:val="en-IN"/>
+        </w:rPr>
+        <w:t>{TALUK}}</w:t>
       </w:r>
       <w:r>
         <w:rPr>
@@ -10535,7 +11065,7 @@
 </file>
 
 <file path=word/endnotes.xml><?xml version="1.0" encoding="utf-8"?>
-<w:endnotes xmlns:wpc="http://schemas.microsoft.com/office/word/2010/wordprocessingCanvas" xmlns:cx="http://schemas.microsoft.com/office/drawing/2014/chartex" xmlns:cx1="http://schemas.microsoft.com/office/drawing/2015/9/8/chartex" xmlns:cx2="http://schemas.microsoft.com/office/drawing/2015/10/21/chartex" xmlns:cx3="http://schemas.microsoft.com/office/drawing/2016/5/9/chartex" xmlns:cx4="http://schemas.microsoft.com/office/drawing/2016/5/10/chartex" xmlns:cx5="http://schemas.microsoft.com/office/drawing/2016/5/11/chartex" xmlns:cx6="http://schemas.microsoft.com/office/drawing/2016/5/12/chartex" xmlns:cx7="http://schemas.microsoft.com/office/drawing/2016/5/13/chartex" xmlns:cx8="http://schemas.microsoft.com/office/drawing/2016/5/14/chartex" xmlns:mc="http://schemas.openxmlformats.org/markup-compatibility/2006" xmlns:aink="http://schemas.microsoft.com/office/drawing/2016/ink" xmlns:am3d="http://schemas.microsoft.com/office/drawing/2017/model3d" xmlns:o="urn:schemas-microsoft-com:office:office" xmlns:oel="http://schemas.microsoft.com/office/2019/extlst" xmlns:r="http://schemas.openxmlformats.org/officeDocument/2006/relationships" xmlns:m="http://schemas.openxmlformats.org/officeDocument/2006/math" xmlns:v="urn:schemas-microsoft-com:vml" xmlns:wp14="http://schemas.microsoft.com/office/word/2010/wordprocessingDrawing" xmlns:wp="http://schemas.openxmlformats.org/drawingml/2006/wordprocessingDrawing" xmlns:w10="urn:schemas-microsoft-com:office:word" xmlns:w="http://schemas.openxmlformats.org/wordprocessingml/2006/main" xmlns:w14="http://schemas.microsoft.com/office/word/2010/wordml" xmlns:w15="http://schemas.microsoft.com/office/word/2012/wordml" xmlns:w16cex="http://schemas.microsoft.com/office/word/2018/wordml/cex" xmlns:w16cid="http://schemas.microsoft.com/office/word/2016/wordml/cid" xmlns:w16="http://schemas.microsoft.com/office/word/2018/wordml" xmlns:w16du="http://schemas.microsoft.com/office/word/2023/wordml/word16du" xmlns:w16sdtdh="http://schemas.microsoft.com/office/word/2020/wordml/sdtdatahash" xmlns:w16sdtfl="http://schemas.microsoft.com/office/word/2024/wordml/sdtformatlock" xmlns:w16se="http://schemas.microsoft.com/office/word/2015/wordml/symex" xmlns:wpg="http://schemas.microsoft.com/office/word/2010/wordprocessingGroup" xmlns:wpi="http://schemas.microsoft.com/office/word/2010/wordprocessingInk" xmlns:wne="http://schemas.microsoft.com/office/word/2006/wordml" xmlns:wps="http://schemas.microsoft.com/office/word/2010/wordprocessingShape" mc:Ignorable="w14 w15 w16se w16cid w16 w16cex w16sdtdh w16sdtfl w16du wp14">
+<w:endnotes xmlns:wpc="http://schemas.microsoft.com/office/word/2010/wordprocessingCanvas" xmlns:cx="http://schemas.microsoft.com/office/drawing/2014/chartex" xmlns:cx1="http://schemas.microsoft.com/office/drawing/2015/9/8/chartex" xmlns:cx2="http://schemas.microsoft.com/office/drawing/2015/10/21/chartex" xmlns:cx3="http://schemas.microsoft.com/office/drawing/2016/5/9/chartex" xmlns:cx4="http://schemas.microsoft.com/office/drawing/2016/5/10/chartex" xmlns:cx5="http://schemas.microsoft.com/office/drawing/2016/5/11/chartex" xmlns:cx6="http://schemas.microsoft.com/office/drawing/2016/5/12/chartex" xmlns:cx7="http://schemas.microsoft.com/office/drawing/2016/5/13/chartex" xmlns:cx8="http://schemas.microsoft.com/office/drawing/2016/5/14/chartex" xmlns:mc="http://schemas.openxmlformats.org/markup-compatibility/2006" xmlns:aink="http://schemas.microsoft.com/office/drawing/2016/ink" xmlns:am3d="http://schemas.microsoft.com/office/drawing/2017/model3d" xmlns:o="urn:schemas-microsoft-com:office:office" xmlns:oel="http://schemas.microsoft.com/office/2019/extlst" xmlns:r="http://schemas.openxmlformats.org/officeDocument/2006/relationships" xmlns:m="http://schemas.openxmlformats.org/officeDocument/2006/math" xmlns:v="urn:schemas-microsoft-com:vml" xmlns:wp14="http://schemas.microsoft.com/office/word/2010/wordprocessingDrawing" xmlns:wp="http://schemas.openxmlformats.org/drawingml/2006/wordprocessingDrawing" xmlns:w10="urn:schemas-microsoft-com:office:word" xmlns:w="http://schemas.openxmlformats.org/wordprocessingml/2006/main" xmlns:w14="http://schemas.microsoft.com/office/word/2010/wordml" xmlns:w15="http://schemas.microsoft.com/office/word/2012/wordml" xmlns:w16cei="http://schemas.microsoft.com/office/word/2026/wordml/cei" xmlns:w16cex="http://schemas.microsoft.com/office/word/2018/wordml/cex" xmlns:w16cid="http://schemas.microsoft.com/office/word/2016/wordml/cid" xmlns:w16="http://schemas.microsoft.com/office/word/2018/wordml" xmlns:w16du="http://schemas.microsoft.com/office/word/2023/wordml/word16du" xmlns:w16sdtdh="http://schemas.microsoft.com/office/word/2020/wordml/sdtdatahash" xmlns:w16sdtfl="http://schemas.microsoft.com/office/word/2024/wordml/sdtformatlock" xmlns:w16se="http://schemas.microsoft.com/office/word/2015/wordml/symex" xmlns:wpg="http://schemas.microsoft.com/office/word/2010/wordprocessingGroup" xmlns:wpi="http://schemas.microsoft.com/office/word/2010/wordprocessingInk" xmlns:wne="http://schemas.microsoft.com/office/word/2006/wordml" xmlns:wps="http://schemas.microsoft.com/office/word/2010/wordprocessingShape" mc:Ignorable="w14 w15 w16se w16cid w16 w16cex w16sdtdh w16sdtfl w16du wp14">
   <w:endnote w:type="separator" w:id="-1">
     <w:p>
       <w:pPr>
@@ -10560,7 +11090,7 @@
 </file>
 
 <file path=word/footnotes.xml><?xml version="1.0" encoding="utf-8"?>
-<w:footnotes xmlns:wpc="http://schemas.microsoft.com/office/word/2010/wordprocessingCanvas" xmlns:cx="http://schemas.microsoft.com/office/drawing/2014/chartex" xmlns:cx1="http://schemas.microsoft.com/office/drawing/2015/9/8/chartex" xmlns:cx2="http://schemas.microsoft.com/office/drawing/2015/10/21/chartex" xmlns:cx3="http://schemas.microsoft.com/office/drawing/2016/5/9/chartex" xmlns:cx4="http://schemas.microsoft.com/office/drawing/2016/5/10/chartex" xmlns:cx5="http://schemas.microsoft.com/office/drawing/2016/5/11/chartex" xmlns:cx6="http://schemas.microsoft.com/office/drawing/2016/5/12/chartex" xmlns:cx7="http://schemas.microsoft.com/office/drawing/2016/5/13/chartex" xmlns:cx8="http://schemas.microsoft.com/office/drawing/2016/5/14/chartex" xmlns:mc="http://schemas.openxmlformats.org/markup-compatibility/2006" xmlns:aink="http://schemas.microsoft.com/office/drawing/2016/ink" xmlns:am3d="http://schemas.microsoft.com/office/drawing/2017/model3d" xmlns:o="urn:schemas-microsoft-com:office:office" xmlns:oel="http://schemas.microsoft.com/office/2019/extlst" xmlns:r="http://schemas.openxmlformats.org/officeDocument/2006/relationships" xmlns:m="http://schemas.openxmlformats.org/officeDocument/2006/math" xmlns:v="urn:schemas-microsoft-com:vml" xmlns:wp14="http://schemas.microsoft.com/office/word/2010/wordprocessingDrawing" xmlns:wp="http://schemas.openxmlformats.org/drawingml/2006/wordprocessingDrawing" xmlns:w10="urn:schemas-microsoft-com:office:word" xmlns:w="http://schemas.openxmlformats.org/wordprocessingml/2006/main" xmlns:w14="http://schemas.microsoft.com/office/word/2010/wordml" xmlns:w15="http://schemas.microsoft.com/office/word/2012/wordml" xmlns:w16cex="http://schemas.microsoft.com/office/word/2018/wordml/cex" xmlns:w16cid="http://schemas.microsoft.com/office/word/2016/wordml/cid" xmlns:w16="http://schemas.microsoft.com/office/word/2018/wordml" xmlns:w16du="http://schemas.microsoft.com/office/word/2023/wordml/word16du" xmlns:w16sdtdh="http://schemas.microsoft.com/office/word/2020/wordml/sdtdatahash" xmlns:w16sdtfl="http://schemas.microsoft.com/office/word/2024/wordml/sdtformatlock" xmlns:w16se="http://schemas.microsoft.com/office/word/2015/wordml/symex" xmlns:wpg="http://schemas.microsoft.com/office/word/2010/wordprocessingGroup" xmlns:wpi="http://schemas.microsoft.com/office/word/2010/wordprocessingInk" xmlns:wne="http://schemas.microsoft.com/office/word/2006/wordml" xmlns:wps="http://schemas.microsoft.com/office/word/2010/wordprocessingShape" mc:Ignorable="w14 w15 w16se w16cid w16 w16cex w16sdtdh w16sdtfl w16du wp14">
+<w:footnotes xmlns:wpc="http://schemas.microsoft.com/office/word/2010/wordprocessingCanvas" xmlns:cx="http://schemas.microsoft.com/office/drawing/2014/chartex" xmlns:cx1="http://schemas.microsoft.com/office/drawing/2015/9/8/chartex" xmlns:cx2="http://schemas.microsoft.com/office/drawing/2015/10/21/chartex" xmlns:cx3="http://schemas.microsoft.com/office/drawing/2016/5/9/chartex" xmlns:cx4="http://schemas.microsoft.com/office/drawing/2016/5/10/chartex" xmlns:cx5="http://schemas.microsoft.com/office/drawing/2016/5/11/chartex" xmlns:cx6="http://schemas.microsoft.com/office/drawing/2016/5/12/chartex" xmlns:cx7="http://schemas.microsoft.com/office/drawing/2016/5/13/chartex" xmlns:cx8="http://schemas.microsoft.com/office/drawing/2016/5/14/chartex" xmlns:mc="http://schemas.openxmlformats.org/markup-compatibility/2006" xmlns:aink="http://schemas.microsoft.com/office/drawing/2016/ink" xmlns:am3d="http://schemas.microsoft.com/office/drawing/2017/model3d" xmlns:o="urn:schemas-microsoft-com:office:office" xmlns:oel="http://schemas.microsoft.com/office/2019/extlst" xmlns:r="http://schemas.openxmlformats.org/officeDocument/2006/relationships" xmlns:m="http://schemas.openxmlformats.org/officeDocument/2006/math" xmlns:v="urn:schemas-microsoft-com:vml" xmlns:wp14="http://schemas.microsoft.com/office/word/2010/wordprocessingDrawing" xmlns:wp="http://schemas.openxmlformats.org/drawingml/2006/wordprocessingDrawing" xmlns:w10="urn:schemas-microsoft-com:office:word" xmlns:w="http://schemas.openxmlformats.org/wordprocessingml/2006/main" xmlns:w14="http://schemas.microsoft.com/office/word/2010/wordml" xmlns:w15="http://schemas.microsoft.com/office/word/2012/wordml" xmlns:w16cei="http://schemas.microsoft.com/office/word/2026/wordml/cei" xmlns:w16cex="http://schemas.microsoft.com/office/word/2018/wordml/cex" xmlns:w16cid="http://schemas.microsoft.com/office/word/2016/wordml/cid" xmlns:w16="http://schemas.microsoft.com/office/word/2018/wordml" xmlns:w16du="http://schemas.microsoft.com/office/word/2023/wordml/word16du" xmlns:w16sdtdh="http://schemas.microsoft.com/office/word/2020/wordml/sdtdatahash" xmlns:w16sdtfl="http://schemas.microsoft.com/office/word/2024/wordml/sdtformatlock" xmlns:w16se="http://schemas.microsoft.com/office/word/2015/wordml/symex" xmlns:wpg="http://schemas.microsoft.com/office/word/2010/wordprocessingGroup" xmlns:wpi="http://schemas.microsoft.com/office/word/2010/wordprocessingInk" xmlns:wne="http://schemas.microsoft.com/office/word/2006/wordml" xmlns:wps="http://schemas.microsoft.com/office/word/2010/wordprocessingShape" mc:Ignorable="w14 w15 w16se w16cid w16 w16cex w16sdtdh w16sdtfl w16du wp14">
   <w:footnote w:type="separator" w:id="-1">
     <w:p>
       <w:pPr>
@@ -10585,7 +11115,7 @@
 </file>
 
 <file path=word/header1.xml><?xml version="1.0" encoding="utf-8"?>
-<w:hdr xmlns:wpc="http://schemas.microsoft.com/office/word/2010/wordprocessingCanvas" xmlns:cx="http://schemas.microsoft.com/office/drawing/2014/chartex" xmlns:cx1="http://schemas.microsoft.com/office/drawing/2015/9/8/chartex" xmlns:cx2="http://schemas.microsoft.com/office/drawing/2015/10/21/chartex" xmlns:cx3="http://schemas.microsoft.com/office/drawing/2016/5/9/chartex" xmlns:cx4="http://schemas.microsoft.com/office/drawing/2016/5/10/chartex" xmlns:cx5="http://schemas.microsoft.com/office/drawing/2016/5/11/chartex" xmlns:cx6="http://schemas.microsoft.com/office/drawing/2016/5/12/chartex" xmlns:cx7="http://schemas.microsoft.com/office/drawing/2016/5/13/chartex" xmlns:cx8="http://schemas.microsoft.com/office/drawing/2016/5/14/chartex" xmlns:mc="http://schemas.openxmlformats.org/markup-compatibility/2006" xmlns:aink="http://schemas.microsoft.com/office/drawing/2016/ink" xmlns:am3d="http://schemas.microsoft.com/office/drawing/2017/model3d" xmlns:o="urn:schemas-microsoft-com:office:office" xmlns:oel="http://schemas.microsoft.com/office/2019/extlst" xmlns:r="http://schemas.openxmlformats.org/officeDocument/2006/relationships" xmlns:m="http://schemas.openxmlformats.org/officeDocument/2006/math" xmlns:v="urn:schemas-microsoft-com:vml" xmlns:wp14="http://schemas.microsoft.com/office/word/2010/wordprocessingDrawing" xmlns:wp="http://schemas.openxmlformats.org/drawingml/2006/wordprocessingDrawing" xmlns:w10="urn:schemas-microsoft-com:office:word" xmlns:w="http://schemas.openxmlformats.org/wordprocessingml/2006/main" xmlns:w14="http://schemas.microsoft.com/office/word/2010/wordml" xmlns:w15="http://schemas.microsoft.com/office/word/2012/wordml" xmlns:w16cex="http://schemas.microsoft.com/office/word/2018/wordml/cex" xmlns:w16cid="http://schemas.microsoft.com/office/word/2016/wordml/cid" xmlns:w16="http://schemas.microsoft.com/office/word/2018/wordml" xmlns:w16du="http://schemas.microsoft.com/office/word/2023/wordml/word16du" xmlns:w16sdtdh="http://schemas.microsoft.com/office/word/2020/wordml/sdtdatahash" xmlns:w16sdtfl="http://schemas.microsoft.com/office/word/2024/wordml/sdtformatlock" xmlns:w16se="http://schemas.microsoft.com/office/word/2015/wordml/symex" xmlns:wpg="http://schemas.microsoft.com/office/word/2010/wordprocessingGroup" xmlns:wpi="http://schemas.microsoft.com/office/word/2010/wordprocessingInk" xmlns:wne="http://schemas.microsoft.com/office/word/2006/wordml" xmlns:wps="http://schemas.microsoft.com/office/word/2010/wordprocessingShape" mc:Ignorable="w14 w15 w16se w16cid w16 w16cex w16sdtdh w16sdtfl w16du wp14">
+<w:hdr xmlns:wpc="http://schemas.microsoft.com/office/word/2010/wordprocessingCanvas" xmlns:cx="http://schemas.microsoft.com/office/drawing/2014/chartex" xmlns:cx1="http://schemas.microsoft.com/office/drawing/2015/9/8/chartex" xmlns:cx2="http://schemas.microsoft.com/office/drawing/2015/10/21/chartex" xmlns:cx3="http://schemas.microsoft.com/office/drawing/2016/5/9/chartex" xmlns:cx4="http://schemas.microsoft.com/office/drawing/2016/5/10/chartex" xmlns:cx5="http://schemas.microsoft.com/office/drawing/2016/5/11/chartex" xmlns:cx6="http://schemas.microsoft.com/office/drawing/2016/5/12/chartex" xmlns:cx7="http://schemas.microsoft.com/office/drawing/2016/5/13/chartex" xmlns:cx8="http://schemas.microsoft.com/office/drawing/2016/5/14/chartex" xmlns:mc="http://schemas.openxmlformats.org/markup-compatibility/2006" xmlns:aink="http://schemas.microsoft.com/office/drawing/2016/ink" xmlns:am3d="http://schemas.microsoft.com/office/drawing/2017/model3d" xmlns:o="urn:schemas-microsoft-com:office:office" xmlns:oel="http://schemas.microsoft.com/office/2019/extlst" xmlns:r="http://schemas.openxmlformats.org/officeDocument/2006/relationships" xmlns:m="http://schemas.openxmlformats.org/officeDocument/2006/math" xmlns:v="urn:schemas-microsoft-com:vml" xmlns:wp14="http://schemas.microsoft.com/office/word/2010/wordprocessingDrawing" xmlns:wp="http://schemas.openxmlformats.org/drawingml/2006/wordprocessingDrawing" xmlns:w10="urn:schemas-microsoft-com:office:word" xmlns:w="http://schemas.openxmlformats.org/wordprocessingml/2006/main" xmlns:w14="http://schemas.microsoft.com/office/word/2010/wordml" xmlns:w15="http://schemas.microsoft.com/office/word/2012/wordml" xmlns:w16cei="http://schemas.microsoft.com/office/word/2026/wordml/cei" xmlns:w16cex="http://schemas.microsoft.com/office/word/2018/wordml/cex" xmlns:w16cid="http://schemas.microsoft.com/office/word/2016/wordml/cid" xmlns:w16="http://schemas.microsoft.com/office/word/2018/wordml" xmlns:w16du="http://schemas.microsoft.com/office/word/2023/wordml/word16du" xmlns:w16sdtdh="http://schemas.microsoft.com/office/word/2020/wordml/sdtdatahash" xmlns:w16sdtfl="http://schemas.microsoft.com/office/word/2024/wordml/sdtformatlock" xmlns:w16se="http://schemas.microsoft.com/office/word/2015/wordml/symex" xmlns:wpg="http://schemas.microsoft.com/office/word/2010/wordprocessingGroup" xmlns:wpi="http://schemas.microsoft.com/office/word/2010/wordprocessingInk" xmlns:wne="http://schemas.microsoft.com/office/word/2006/wordml" xmlns:wps="http://schemas.microsoft.com/office/word/2010/wordprocessingShape" mc:Ignorable="w14 w15 w16se w16cid w16 w16cex w16sdtdh w16sdtfl w16du wp14">
   <w:p>
     <w:pPr>
       <w:pBdr>
@@ -10648,7 +11178,31 @@
         <w:sz w:val="24"/>
         <w:szCs w:val="24"/>
       </w:rPr>
-      <w:t xml:space="preserve">Er. R.Sanjeevan, </w:t>
+      <w:t xml:space="preserve">Er. </w:t>
+    </w:r>
+    <w:proofErr w:type="spellStart"/>
+    <w:proofErr w:type="gramStart"/>
+    <w:r>
+      <w:rPr>
+        <w:rFonts w:ascii="Times New Roman" w:hAnsi="Times New Roman" w:cs="Times New Roman"/>
+        <w:b/>
+        <w:color w:val="002060"/>
+        <w:sz w:val="24"/>
+        <w:szCs w:val="24"/>
+      </w:rPr>
+      <w:t>R.Sanjeevan</w:t>
+    </w:r>
+    <w:proofErr w:type="spellEnd"/>
+    <w:proofErr w:type="gramEnd"/>
+    <w:r>
+      <w:rPr>
+        <w:rFonts w:ascii="Times New Roman" w:hAnsi="Times New Roman" w:cs="Times New Roman"/>
+        <w:b/>
+        <w:color w:val="002060"/>
+        <w:sz w:val="24"/>
+        <w:szCs w:val="24"/>
+      </w:rPr>
+      <w:t xml:space="preserve">, </w:t>
     </w:r>
     <w:r>
       <w:rPr>
@@ -10719,6 +11273,8 @@
         <w:szCs w:val="24"/>
       </w:rPr>
     </w:pPr>
+    <w:proofErr w:type="spellStart"/>
+    <w:proofErr w:type="gramStart"/>
     <w:r>
       <w:rPr>
         <w:rFonts w:ascii="Times New Roman" w:hAnsi="Times New Roman" w:cs="Times New Roman"/>
@@ -10727,7 +11283,41 @@
         <w:sz w:val="24"/>
         <w:szCs w:val="24"/>
       </w:rPr>
-      <w:t>B.ScEngg (Honrs), MBA, PhD, Post Doc Fellow.,</w:t>
+      <w:t>B.ScEngg</w:t>
+    </w:r>
+    <w:proofErr w:type="spellEnd"/>
+    <w:proofErr w:type="gramEnd"/>
+    <w:r>
+      <w:rPr>
+        <w:rFonts w:ascii="Times New Roman" w:hAnsi="Times New Roman" w:cs="Times New Roman"/>
+        <w:b/>
+        <w:color w:val="984806" w:themeColor="accent6" w:themeShade="80"/>
+        <w:sz w:val="24"/>
+        <w:szCs w:val="24"/>
+      </w:rPr>
+      <w:t xml:space="preserve"> (</w:t>
+    </w:r>
+    <w:proofErr w:type="spellStart"/>
+    <w:r>
+      <w:rPr>
+        <w:rFonts w:ascii="Times New Roman" w:hAnsi="Times New Roman" w:cs="Times New Roman"/>
+        <w:b/>
+        <w:color w:val="984806" w:themeColor="accent6" w:themeShade="80"/>
+        <w:sz w:val="24"/>
+        <w:szCs w:val="24"/>
+      </w:rPr>
+      <w:t>Honrs</w:t>
+    </w:r>
+    <w:proofErr w:type="spellEnd"/>
+    <w:r>
+      <w:rPr>
+        <w:rFonts w:ascii="Times New Roman" w:hAnsi="Times New Roman" w:cs="Times New Roman"/>
+        <w:b/>
+        <w:color w:val="984806" w:themeColor="accent6" w:themeShade="80"/>
+        <w:sz w:val="24"/>
+        <w:szCs w:val="24"/>
+      </w:rPr>
+      <w:t>), MBA, PhD, Post Doc Fellow.,</w:t>
     </w:r>
     <w:r>
       <w:rPr>
@@ -10925,6 +11515,7 @@
         <w:szCs w:val="24"/>
       </w:rPr>
     </w:pPr>
+    <w:proofErr w:type="spellStart"/>
     <w:r>
       <w:rPr>
         <w:rFonts w:ascii="Times New Roman" w:hAnsi="Times New Roman" w:cs="Times New Roman"/>
@@ -10933,7 +11524,18 @@
         <w:sz w:val="24"/>
         <w:szCs w:val="24"/>
       </w:rPr>
-      <w:t>Reg.Valuer - CBDT and IBBI.</w:t>
+      <w:t>Reg.Valuer</w:t>
+    </w:r>
+    <w:proofErr w:type="spellEnd"/>
+    <w:r>
+      <w:rPr>
+        <w:rFonts w:ascii="Times New Roman" w:hAnsi="Times New Roman" w:cs="Times New Roman"/>
+        <w:b/>
+        <w:color w:val="31849B" w:themeColor="accent5" w:themeShade="BF"/>
+        <w:sz w:val="24"/>
+        <w:szCs w:val="24"/>
+      </w:rPr>
+      <w:t xml:space="preserve"> - CBDT and IBBI.</w:t>
     </w:r>
     <w:r>
       <w:rPr>
@@ -11526,7 +12128,6 @@
   <w:style w:type="character" w:default="1" w:styleId="DefaultParagraphFont">
     <w:name w:val="Default Paragraph Font"/>
     <w:uiPriority w:val="1"/>
-    <w:semiHidden/>
     <w:unhideWhenUsed/>
   </w:style>
   <w:style w:type="table" w:default="1" w:styleId="TableNormal">

</xml_diff>